<commit_message>
docs(sprint13): document Sprint 13 iteration plan and progress status
Adds the Sprint 13 Plan de Iteración (MINSA/SINADEF API + wearables-IA)
and updates the general iteration plan (v1.1) and agile methodology doc
to reflect its in-progress status, with an explicit scope note on the
wearables-vitals rule-based validation decision.

Co-Authored-By: Claude Sonnet 5 <noreply@anthropic.com>
</commit_message>
<xml_diff>
--- a/Documentation/informes/Plan_Iteracion_Proyecto_RespiCare.docx
+++ b/Documentation/informes/Plan_Iteracion_Proyecto_RespiCare.docx
@@ -221,6 +221,48 @@
           </w:p>
         </w:tc>
       </w:tr>
+      <w:tr>
+        <w:tc>
+          <w:tcPr>
+            <w:tcW w:type="dxa" w:w="1890"/>
+          </w:tcPr>
+          <w:p>
+            <w:r>
+              <w:t>1.1</w:t>
+            </w:r>
+          </w:p>
+        </w:tc>
+        <w:tc>
+          <w:tcPr>
+            <w:tcW w:type="dxa" w:w="2059"/>
+          </w:tcPr>
+          <w:p>
+            <w:r>
+              <w:t>11/09/2026</w:t>
+            </w:r>
+          </w:p>
+        </w:tc>
+        <w:tc>
+          <w:tcPr>
+            <w:tcW w:type="dxa" w:w="1897"/>
+          </w:tcPr>
+          <w:p>
+            <w:r>
+              <w:t>Chávez Linares, Cesar Fabian</w:t>
+            </w:r>
+          </w:p>
+        </w:tc>
+        <w:tc>
+          <w:tcPr>
+            <w:tcW w:type="dxa" w:w="4116"/>
+          </w:tcPr>
+          <w:p>
+            <w:r>
+              <w:t>Se agrega el Sprint 13 (pendiente de ejecución) como extensión de alcance: API de interoperabilidad MINSA/SINADEF e integración wearables-IA.</w:t>
+            </w:r>
+          </w:p>
+        </w:tc>
+      </w:tr>
     </w:tbl>
     <w:p>
       <w:pPr>
@@ -243,10 +285,7 @@
         </w:rPr>
       </w:pPr>
       <w:r>
-        <w:rPr>
-          <w:lang w:val="es-PE"/>
-        </w:rPr>
-        <w:t>Este documento consolida en un solo Plan de Iteración las 13 iteraciones (Sprint 0 a Sprint 12) ya ejecutadas y documentadas en el proyecto, según el sustento verificado en Documentation/METODOLOGIA_AGIL_PROYECTO.md (framework Scrum adaptado con elementos Kanban y XP, 12 sprints de desarrollo más el Sprint 0 de arquitectura, con métricas de velocity, cobertura y calidad por sprint) y en Documentation/informes/Informe_Resultados_Plan_Iteraciones.md (resultados detallados con aprobación SQA de las iteraciones del módulo de diagnóstico).</w:t>
+        <w:t>Este documento consolida en un solo Plan de Iteración las 13 iteraciones (Sprint 0 a Sprint 12) ya ejecutadas y documentadas en el proyecto, según el sustento verificado en METODOLOGIA_AGIL_PROYECTO.md (framework Scrum adaptado con elementos Kanban y XP, 12 sprints de desarrollo más el Sprint 0 de arquitectura, con métricas de velocity, cobertura y calidad por sprint) y en el Informe de Resultados del Plan de Iteraciones (resultados detallados con aprobación SQA de las iteraciones del módulo de diagnóstico). Adicionalmente incorpora el Sprint 13 (pendiente de ejecución), una extensión de alcance identificada en una revisión posterior de requerimientos, objetivos y avances del proyecto.</w:t>
       </w:r>
     </w:p>
     <w:tbl>
@@ -314,17 +353,8 @@
             <w:tcW w:w="4873" w:type="dxa"/>
           </w:tcPr>
           <w:p>
-            <w:pPr>
-              <w:cnfStyle w:val="000000100000" w:firstRow="0" w:lastRow="0" w:firstColumn="0" w:lastColumn="0" w:oddVBand="0" w:evenVBand="0" w:oddHBand="1" w:evenHBand="0" w:firstRowFirstColumn="0" w:firstRowLastColumn="0" w:lastRowFirstColumn="0" w:lastRowLastColumn="0"/>
-              <w:rPr>
-                <w:lang w:val="es-PE"/>
-              </w:rPr>
-            </w:pPr>
-            <w:r>
-              <w:rPr>
-                <w:lang w:val="es-PE"/>
-              </w:rPr>
-              <w:t>General del Proyecto (Sprint 0 a Sprint 12 — 13 iteraciones)</w:t>
+            <w:r>
+              <w:t>General del Proyecto (Sprint 0 a Sprint 12 — 13 iteraciones completadas) + Sprint 13 (extensión pendiente)</w:t>
             </w:r>
           </w:p>
         </w:tc>
@@ -375,11 +405,8 @@
             <w:tcW w:w="4873" w:type="dxa"/>
           </w:tcPr>
           <w:p>
-            <w:pPr>
-              <w:cnfStyle w:val="000000100000" w:firstRow="0" w:lastRow="0" w:firstColumn="0" w:lastColumn="0" w:oddVBand="0" w:evenVBand="0" w:oddHBand="1" w:evenHBand="0" w:firstRowFirstColumn="0" w:firstRowLastColumn="0" w:lastRowFirstColumn="0" w:lastRowLastColumn="0"/>
-            </w:pPr>
-            <w:r>
-              <w:t>Semana 26</w:t>
+            <w:r>
+              <w:t>Semana 26 (cierre de las 13 iteraciones) / Semana 28 (fin planificado del Sprint 13, pendiente)</w:t>
             </w:r>
           </w:p>
         </w:tc>
@@ -488,10 +515,7 @@
         </w:rPr>
       </w:pPr>
       <w:r>
-        <w:rPr>
-          <w:lang w:val="es-PE"/>
-        </w:rPr>
-        <w:t>Incluye: las 13 iteraciones documentadas — Sprint 0 (arquitectura y setup), Sprints 1-4 (MVP: autenticación, frontend/dashboard, servicios de IA, chatbot y analytics básicos), Sprints 5-8 (sistema de Machine Learning con Random Forest/XGBoost, explicabilidad SHAP e integración con el chatbot), Sprint 9 (refinamiento, documentación y preparación para producción) y Sprints 10-12 (interoperabilidad HL7/FHIR, dashboard ejecutivo y modelos ML predictivos).</w:t>
+        <w:t>Incluye: las 13 iteraciones documentadas — Sprint 0 (arquitectura y setup), Sprints 1-4 (MVP: autenticación, frontend/dashboard, servicios de IA, chatbot y analytics básicos), Sprints 5-8 (sistema de Machine Learning con Random Forest/XGBoost, explicabilidad SHAP e integración con el chatbot), Sprint 9 (refinamiento, documentación y preparación para producción) y Sprints 10-12 (interoperabilidad HL7/FHIR, dashboard ejecutivo y modelos ML predictivos). Como extensión de alcance, se agrega el Sprint 13 (pendiente de ejecución): API de interoperabilidad MINSA/SINADEF e integración de wearables con los servicios de IA.</w:t>
       </w:r>
     </w:p>
     <w:p>
@@ -501,10 +525,7 @@
         </w:rPr>
       </w:pPr>
       <w:r>
-        <w:rPr>
-          <w:lang w:val="es-PE"/>
-        </w:rPr>
-        <w:t>Excluye: iteraciones futuras no documentadas aún en la metodología ágil del proyecto, como la integración completa de wearables con los servicios de IA (actualmente Health Connect/HealthKit son stubs y el pipeline de IA no consume datos de wearables) y el módulo de emergencias y ambulancias, previstos como iteraciones posteriores.</w:t>
+        <w:t>Excluye: el módulo de emergencias y ambulancias, previsto como iteración futura aún no planificada formalmente. La integración completa de wearables con los servicios de IA y la interoperabilidad institucional con MINSA/SINADEF dejan de estar excluidas y pasan a planificarse como el Sprint 13 (pendiente de ejecución, ver sección 4).</w:t>
       </w:r>
     </w:p>
     <w:p>
@@ -528,10 +549,7 @@
         </w:rPr>
       </w:pPr>
       <w:r>
-        <w:rPr>
-          <w:lang w:val="es-PE"/>
-        </w:rPr>
-        <w:t>Entregables verificables comprometidos, uno por cada una de las 13 iteraciones del proyecto:</w:t>
+        <w:t>Entregables verificables comprometidos, uno por cada una de las 13 iteraciones completadas del proyecto, más el Sprint 13 (pendiente de ejecución) agregado como extensión de alcance:</w:t>
       </w:r>
     </w:p>
     <w:tbl>
@@ -1142,6 +1160,38 @@
             </w:pPr>
             <w:r>
               <w:t>✅</w:t>
+            </w:r>
+          </w:p>
+        </w:tc>
+      </w:tr>
+      <w:tr>
+        <w:tc>
+          <w:tcPr>
+            <w:tcW w:type="dxa" w:w="3249"/>
+          </w:tcPr>
+          <w:p>
+            <w:r>
+              <w:t>Sprint 13 — Interoperabilidad MINSA/SINADEF y Wearables-IA (PENDIENTE)</w:t>
+            </w:r>
+          </w:p>
+        </w:tc>
+        <w:tc>
+          <w:tcPr>
+            <w:tcW w:type="dxa" w:w="3249"/>
+          </w:tcPr>
+          <w:p>
+            <w:r>
+              <w:t>API de interoperabilidad MINSA/SINADEF (envío/recepción de información) e integración del pipeline de wearables (BLE) con los modelos de IA</w:t>
+            </w:r>
+          </w:p>
+        </w:tc>
+        <w:tc>
+          <w:tcPr>
+            <w:tcW w:type="dxa" w:w="3249"/>
+          </w:tcPr>
+          <w:p>
+            <w:r>
+              <w:t>🔲 Pendiente</w:t>
             </w:r>
           </w:p>
         </w:tc>
@@ -1163,7 +1213,7 @@
         </w:rPr>
       </w:pPr>
       <w:r>
-        <w:t>Cronograma consolidado de las 13 iteraciones, expresado en semanas de proyecto (26 semanas / 6 meses en total), conforme a las duraciones documentadas por fase en Documentation/METODOLOGIA_AGIL_PROYECTO.md.</w:t>
+        <w:t>Cronograma consolidado de las 13 iteraciones, expresado en semanas de proyecto (26 semanas / 6 meses en total), conforme a las duraciones documentadas por fase en METODOLOGIA_AGIL_PROYECTO.md, más el Sprint 13 (extensión pendiente, Semana 27-28, aún no iniciado).</w:t>
       </w:r>
     </w:p>
     <w:tbl>
@@ -2292,6 +2342,68 @@
             </w:pPr>
             <w:r>
               <w:t>Completado</w:t>
+            </w:r>
+          </w:p>
+        </w:tc>
+      </w:tr>
+      <w:tr>
+        <w:tc>
+          <w:tcPr>
+            <w:tcW w:type="dxa" w:w="1624"/>
+          </w:tcPr>
+          <w:p>
+            <w:r>
+              <w:t>Sprint 13</w:t>
+            </w:r>
+          </w:p>
+        </w:tc>
+        <w:tc>
+          <w:tcPr>
+            <w:tcW w:type="dxa" w:w="1624"/>
+          </w:tcPr>
+          <w:p>
+            <w:r>
+              <w:t>Extensión: Interoperabilidad MINSA/SINADEF y Wearables-IA</w:t>
+            </w:r>
+          </w:p>
+        </w:tc>
+        <w:tc>
+          <w:tcPr>
+            <w:tcW w:type="dxa" w:w="1624"/>
+          </w:tcPr>
+          <w:p>
+            <w:r>
+              <w:t>Equipo de desarrollo</w:t>
+            </w:r>
+          </w:p>
+        </w:tc>
+        <w:tc>
+          <w:tcPr>
+            <w:tcW w:type="dxa" w:w="1624"/>
+          </w:tcPr>
+          <w:p>
+            <w:r>
+              <w:t>Semana 27</w:t>
+            </w:r>
+          </w:p>
+        </w:tc>
+        <w:tc>
+          <w:tcPr>
+            <w:tcW w:type="dxa" w:w="1624"/>
+          </w:tcPr>
+          <w:p>
+            <w:r>
+              <w:t>Semana 28</w:t>
+            </w:r>
+          </w:p>
+        </w:tc>
+        <w:tc>
+          <w:tcPr>
+            <w:tcW w:type="dxa" w:w="1624"/>
+          </w:tcPr>
+          <w:p>
+            <w:r>
+              <w:t>Pendiente</w:t>
             </w:r>
           </w:p>
         </w:tc>
@@ -2546,11 +2658,40 @@
             <w:tcW w:w="3249" w:type="dxa"/>
           </w:tcPr>
           <w:p>
-            <w:pPr>
-              <w:cnfStyle w:val="000000000000" w:firstRow="0" w:lastRow="0" w:firstColumn="0" w:lastColumn="0" w:oddVBand="0" w:evenVBand="0" w:oddHBand="0" w:evenHBand="0" w:firstRowFirstColumn="0" w:firstRowLastColumn="0" w:lastRowFirstColumn="0" w:lastRowLastColumn="0"/>
-            </w:pPr>
-            <w:r>
-              <w:t>Documentado explícitamente como fuera de alcance de las 13 iteraciones actuales; planificado como iteración futura</w:t>
+            <w:r>
+              <w:t>Planificado y documentado como Sprint 13 (pendiente de ejecución): extensión del pipeline backend→ai-services para incorporar features de wearables, con fallback automático al modelo sin wearables</w:t>
+            </w:r>
+          </w:p>
+        </w:tc>
+      </w:tr>
+      <w:tr>
+        <w:tc>
+          <w:tcPr>
+            <w:tcW w:type="dxa" w:w="3249"/>
+          </w:tcPr>
+          <w:p>
+            <w:r>
+              <w:t>Ausencia de integración institucional con MINSA/SINADEF (Fase 4 del Documento de Visión, no ejecutada)</w:t>
+            </w:r>
+          </w:p>
+        </w:tc>
+        <w:tc>
+          <w:tcPr>
+            <w:tcW w:type="dxa" w:w="3249"/>
+          </w:tcPr>
+          <w:p>
+            <w:r>
+              <w:t>Medio</w:t>
+            </w:r>
+          </w:p>
+        </w:tc>
+        <w:tc>
+          <w:tcPr>
+            <w:tcW w:type="dxa" w:w="3249"/>
+          </w:tcPr>
+          <w:p>
+            <w:r>
+              <w:t>Planificado como Sprint 13 (pendiente): API de interoperabilidad construida sobre el estándar HL7/FHIR ya adoptado (fhirService.ts), evitando un formato ad-hoc</w:t>
             </w:r>
           </w:p>
         </w:tc>
@@ -2856,6 +2997,38 @@
           </w:p>
         </w:tc>
       </w:tr>
+      <w:tr>
+        <w:tc>
+          <w:tcPr>
+            <w:tcW w:type="dxa" w:w="1640"/>
+          </w:tcPr>
+          <w:p>
+            <w:r>
+              <w:t>Plan de Iteración detallado del Sprint 13 (pendiente)</w:t>
+            </w:r>
+          </w:p>
+        </w:tc>
+        <w:tc>
+          <w:tcPr>
+            <w:tcW w:type="dxa" w:w="6581"/>
+          </w:tcPr>
+          <w:p>
+            <w:r>
+              <w:t>Documentation/informes/Plan_Iteracion_Sprint13_RespiCare.docx</w:t>
+            </w:r>
+          </w:p>
+        </w:tc>
+        <w:tc>
+          <w:tcPr>
+            <w:tcW w:type="dxa" w:w="1741"/>
+          </w:tcPr>
+          <w:p>
+            <w:r>
+              <w:t>Cesar Fabian Chavez Linares</w:t>
+            </w:r>
+          </w:p>
+        </w:tc>
+      </w:tr>
     </w:tbl>
     <w:p>
       <w:pPr>
@@ -2872,7 +3045,7 @@
         </w:rPr>
       </w:pPr>
       <w:r>
-        <w:t>Métricas finales consolidadas del proyecto completo (13 iteraciones), tomadas de Documentation/METODOLOGIA_AGIL_PROYECTO.md:</w:t>
+        <w:t>Métricas finales consolidadas del proyecto completo (13 iteraciones), tomadas de Documentation/METODOLOGIA_AGIL_PROYECTO.md. Estas métricas reflejan únicamente las 13 iteraciones completadas (Sprint 0 a Sprint 12); el Sprint 13 (extensión pendiente) aún no aporta resultados medibles.</w:t>
       </w:r>
     </w:p>
     <w:tbl>
@@ -3359,7 +3532,7 @@
         </w:rPr>
       </w:pPr>
       <w:r>
-        <w:t>Las 13 iteraciones documentadas demuestran una ejecución ágil exitosa del proyecto completo, superando las metas planificadas de sprints (120%), story points (116%) y calidad (accuracy ML 105%, cobertura de pruebas 103-111%). Los desafíos superados incluyen la adaptación a TypeScript strict mode, la integración SHAP compleja y el despliegue multi-servicio con Docker. Las iteraciones futuras (no incluidas en este consolidado) deberán abordar la integración completa de wearables con el pipeline de IA y el módulo de emergencias y ambulancias.</w:t>
+        <w:t>Las 13 iteraciones documentadas demuestran una ejecución ágil exitosa del proyecto completo, superando las metas planificadas de sprints (120%), story points (116%) y calidad (accuracy ML 105%, cobertura de pruebas 103-111%). Los desafíos superados incluyen la adaptación a TypeScript strict mode, la integración SHAP compleja y el despliegue multi-servicio con Docker. Como extensión de alcance identificada tras el cierre del proyecto original, se agregó el Sprint 13 (pendiente de ejecución) para abordar la integración completa de wearables con el pipeline de IA y una API de interoperabilidad con MINSA/SINADEF — documentado en Plan_Iteracion_Sprint13_RespiCare. El módulo de emergencias y ambulancias permanece como iteración futura aún no planificada formalmente.</w:t>
       </w:r>
     </w:p>
     <w:sectPr>

</xml_diff>